<commit_message>
docs: 3축 문서 2026-08-14 갱신
기획서 / MASTER / PLAN 동시 갱신. 판정 숫자가 바뀌어 셋 다 손대야 했다.

기획서
- 판정 결과 1,087/443/191/57/396 → 1,102/386/210/62/444
- 그래프 엣지 3,444 → 3,427
- 기준일 08-13 → 08-14

MASTER
- §2 판정 갱신
- §4 소방서 7구간 대조를 "검증"이 아니라 "적합"으로 정정.
  절대편차를 12.6→7.24 로 줄이는 데 게이트로 썼으므로 검증 수단이 아니다.
  현재 외부 검증 수단은 0개이며 실측 트랙 C(봉인 5구간)가 대신한다
- §6 가로등: 마커 금지 → 지점 마커 + 등수 √n 굵기 + 반경 50m 원
- §13 0-3 신설: 도로폭 미탐 77건 제거 · 검증 축 3개 · 발견 결함 · 백업
- §16 결정 72~82 + 근거. 71(seg_id 불변키 폐기)은 72(seg_uid)로 완료
- §16 미결: ngii1k STEPS 해소 삭제, 근거 없는 상수 5개 · 측도 병합 · 청구 2건
- §17 어겼던 것 6건 · 진단 도구 7건 추가
- §18 데이터 관리 신설

PLAN
- 13-2 재현성 구멍 해소 · 13-3 가로등 결정 승격
- 13-5 wmax/wmin 비교 안 폐기 기록
- 14 신설: 트랙 A/B/C · 오차 줄이는 순서 · 근거 없는 상수 · 다음 순서
</commit_message>
<xml_diff>
--- a/docs/기획서_Fire-Lane.docx
+++ b/docs/기획서_Fire-Lane.docx
@@ -87,7 +87,7 @@
           <w:sz w:val="22"/>
           <w:szCs w:val="22"/>
         </w:rPr>
-        <w:t xml:space="preserve">2026. 08. 13.</w:t>
+        <w:t xml:space="preserve">2026. 08. 14.</w:t>
       </w:r>
     </w:p>
     <w:p>
@@ -166,7 +166,7 @@
           <w:sz w:val="18"/>
           <w:szCs w:val="18"/>
         </w:rPr>
-        <w:t xml:space="preserve">※ 수치 표기 원칙: 본 문서의 모든 수치는 2026-08-13 기준으로 원본 데이터에서 코드로 재산출한 값이며, 파이프라인 한 명령(src/etl/pipeline.py)으로 재현된다. 행정구역경계는 2026-08-11 에 확보하여 잠정치를 전부 교체했다. 판정 결과는 산출단위 1,087구간 · 통행 가능 443 · 판정 보류 191 · 통행 불가 57 · 영상판정 불가 396 이며, 폭 산출 불가 구간은 0 이다. 폭 값은 아직 현장 실측 전이므로 width_verified 는 false 이고, 실측 후 값이 바뀌되 산출 구조와 필드는 바뀌지 않는다. 잔여 잠정치는 '(잠정)'으로 별도 표기하며, 확정 시 교체한다.</w:t>
+        <w:t xml:space="preserve">※ 수치 표기 원칙: 본 문서의 모든 수치는 2026-08-14 기준으로 원본 데이터에서 코드로 재산출한 값이며, 파이프라인 한 명령(src/etl/pipeline.py)으로 재현된다. 행정구역경계는 2026-08-11 에 확보하여 잠정치를 전부 교체했다. 판정 결과는 산출단위 1,102구간 · 통행 가능 386 · 판정 보류 210 · 통행 불가 62 · 영상판정 불가 444 이며, 폭 산출 불가 구간은 0 이다. 폭 값은 아직 현장 실측 전이므로 width_verified 는 false 이고, 실측 후 값이 바뀌되 산출 구조와 필드는 바뀌지 않는다. 잔여 잠정치는 '(잠정)'으로 별도 표기하며, 확정 시 교체한다.</w:t>
       </w:r>
     </w:p>
     <w:p>
@@ -6577,7 +6577,7 @@
                 <w:sz w:val="18"/>
                 <w:szCs w:val="18"/>
               </w:rPr>
-              <w:t xml:space="preserve">• 세그먼트 수·판정 분포 확정(2026-08-13, 1,087구간). 폭 미산출 0</w:t>
+              <w:t xml:space="preserve">• 세그먼트 수·판정 분포 확정(2026-08-14, 1,102구간). 폭 미산출 0</w:t>
             </w:r>
           </w:p>
           <w:p>
@@ -8928,7 +8928,7 @@
                 <w:sz w:val="18"/>
                 <w:szCs w:val="18"/>
               </w:rPr>
-              <w:t xml:space="preserve">bbox 클리핑 기준으로 파이프라인을 선구축하고 경계 확보 시 재실행. 2026-08-11 경계 확보 후 재실행하여 1,087 산출단위로 확정했다. 이 대응 방식이 실제로 작동한 사례다.</w:t>
+              <w:t xml:space="preserve">bbox 클리핑 기준으로 파이프라인을 선구축하고 경계 확보 시 재실행. 2026-08-11 경계 확보 후 재실행하여 1,102 산출단위로 확정했다. 이 대응 방식이 실제로 작동한 사례다.</w:t>
             </w:r>
           </w:p>
         </w:tc>
@@ -18386,7 +18386,7 @@
           <w:sz w:val="18"/>
           <w:szCs w:val="18"/>
         </w:rPr>
-        <w:t xml:space="preserve">• NFR-PER-001 (경로 산출 응답): 동명동 스코프 그래프(확정 1,087 산출단위 / 그래프 엣지 3,444)에서 단일 출발-도착 경로 산출은 1초 이내에 완료되어야 한다.</w:t>
+        <w:t xml:space="preserve">• NFR-PER-001 (경로 산출 응답): 동명동 스코프 그래프(확정 1,102 산출단위 / 그래프 엣지 3,427)에서 단일 출발-도착 경로 산출은 1초 이내에 완료되어야 한다.</w:t>
       </w:r>
     </w:p>
     <w:p>
@@ -31522,7 +31522,7 @@
           <w:sz w:val="19"/>
           <w:szCs w:val="19"/>
         </w:rPr>
-        <w:t xml:space="preserve">노딩 결과 (2026-08-13 확정): 도로구간 1,508 → 그래프 엣지 3,444 / 산출단위 1,087. 끝점 투영 스냅 0.5m 로 연결요소 40개(최대 93.29%)를 6개(99.76%)로 복원했고, 노드 식별 반경 0.5m 접합으로 길이 0.0m 자기루프 224개를 제거했다. 이 224개 중 40개는 통행 가능(초록)으로 표출되고 있었다.</w:t>
+        <w:t xml:space="preserve">노딩 결과 (2026-08-14 확정): 도로구간 1,508 → 그래프 엣지 3,427 / 산출단위 1,102. 끝점 투영 스냅 0.5m 로 연결요소 40개(최대 93.29%)를 6개(99.76%)로 복원했고, 노드 식별 반경 0.5m 접합으로 길이 0.0m 자기루프 224개를 제거했다. 이 224개 중 40개는 통행 가능(초록)으로 표출되고 있었다.</w:t>
       </w:r>
     </w:p>
     <w:p>

</xml_diff>

<commit_message>
docs: 기획서 #5 #8 #10 + unknown 사유 — PLAN §12 열 건 전부 종결 (#94)
</commit_message>
<xml_diff>
--- a/docs/기획서_Fire-Lane.docx
+++ b/docs/기획서_Fire-Lane.docx
@@ -527,7 +527,7 @@
                 <w:sz w:val="18"/>
                 <w:szCs w:val="18"/>
               </w:rPr>
-              <w:t xml:space="preserve">일정·그라운드룰·노션 / 발표 스토리라인 / 평가지표·베이스라인 설계</w:t>
+              <w:t>PM · part/infra 담당 — 일정·그라운드룰 / 발표 스토리라인 / 평가지표·베이스라인 설계 / FastAPI · 스케줄러 · DB · 도커 · AWS / 릴리즈 매니저(main 머지 승인)</w:t>
             </w:r>
           </w:p>
         </w:tc>
@@ -586,7 +586,7 @@
                 <w:sz w:val="18"/>
                 <w:szCs w:val="18"/>
               </w:rPr>
-              <w:t xml:space="preserve">컴퓨터비전 — 캘리브레이션 · 호모그래피 · 유효 통행폭 산출 / 오차 특성 분석</w:t>
+              <w:t>part/cv 담당 — 캘리브레이션 · 호모그래피 · 유효 통행폭 산출 / 오차 특성 분석</w:t>
             </w:r>
           </w:p>
         </w:tc>
@@ -645,7 +645,7 @@
                 <w:sz w:val="18"/>
                 <w:szCs w:val="18"/>
               </w:rPr>
-              <w:t xml:space="preserve">GIS 전담 — 데이터 파이프라인 · 도로폭 산출 · 그래프 구축 · 경로탐색 구현</w:t>
+              <w:t>part/gis 담당 — 데이터 파이프라인 · 도로폭 산출 · 그래프 구축 · 경로탐색 구현 / 저장소 규율</w:t>
             </w:r>
           </w:p>
         </w:tc>
@@ -704,7 +704,7 @@
                 <w:sz w:val="18"/>
                 <w:szCs w:val="18"/>
               </w:rPr>
-              <w:t xml:space="preserve">데이터 소스 검증(실폭도로·수치지도·정사영상) / 백엔드 · 인프라 · 배포</w:t>
+              <w:t>part/cv 담당 — 세그멘테이션 · 주정차 판별 / 데이터 소스 검증(실폭도로·수치지도·정사영상)</w:t>
             </w:r>
           </w:p>
         </w:tc>
@@ -763,7 +763,7 @@
                 <w:sz w:val="18"/>
                 <w:szCs w:val="18"/>
               </w:rPr>
-              <w:t xml:space="preserve">경로 알고리즘 설계(A*·휴리스틱) / 소방서 인터뷰 · 차량 제원 확보 / 장애물 조사</w:t>
+              <w:t>part/gis 담당 — 경로 알고리즘 설계(A*·휴리스틱) / 화면·3D / 소방서 인터뷰 · 차량 제원 확보</w:t>
             </w:r>
           </w:p>
         </w:tc>
@@ -23662,7 +23662,7 @@
                 <w:sz w:val="18"/>
                 <w:szCs w:val="18"/>
               </w:rPr>
-              <w:t>clear | needs_cv | blocked</w:t>
+              <w:t>clear | needs_cv | blocked | unknown</w:t>
             </w:r>
           </w:p>
         </w:tc>
@@ -28809,6 +28809,136 @@
     </w:p>
     <w:p>
       <w:pPr>
+        <w:spacing w:after="140" w:before="0" w:line="264"/>
+      </w:pPr>
+      <w:r>
+        <w:rPr>
+          <w:rFonts w:ascii="맑은 고딕" w:cs="맑은 고딕" w:eastAsia="맑은 고딕" w:hAnsi="맑은 고딕"/>
+          <w:sz w:val="19"/>
+          <w:szCs w:val="19"/>
+        </w:rPr>
+        <w:t>□ 배제한 데이터와 그 근거</w:t>
+      </w:r>
+    </w:p>
+    <w:p>
+      <w:pPr>
+        <w:spacing w:after="140" w:before="0" w:line="264"/>
+      </w:pPr>
+      <w:r>
+        <w:rPr>
+          <w:rFonts w:ascii="맑은 고딕" w:cs="맑은 고딕" w:eastAsia="맑은 고딕" w:hAnsi="맑은 고딕"/>
+          <w:sz w:val="19"/>
+          <w:szCs w:val="19"/>
+        </w:rPr>
+        <w:t>- ROAD_BT(도로명주소 명목 폭): 84% 구간에서 과대하며 미탐 방향이다. 폭 값으로는 금지한다.</w:t>
+      </w:r>
+    </w:p>
+    <w:p>
+      <w:pPr>
+        <w:spacing w:after="140" w:before="0" w:line="264"/>
+      </w:pPr>
+      <w:r>
+        <w:rPr>
+          <w:rFonts w:ascii="맑은 고딕" w:cs="맑은 고딕" w:eastAsia="맑은 고딕" w:hAnsi="맑은 고딕"/>
+          <w:sz w:val="19"/>
+          <w:szCs w:val="19"/>
+        </w:rPr>
+        <w:t>- 화재 연간통계: 읍면동 컬럼이 없다. 시군구까지만 집계된다.</w:t>
+      </w:r>
+    </w:p>
+    <w:p>
+      <w:pPr>
+        <w:spacing w:after="140" w:before="0" w:line="264"/>
+      </w:pPr>
+      <w:r>
+        <w:rPr>
+          <w:rFonts w:ascii="맑은 고딕" w:cs="맑은 고딕" w:eastAsia="맑은 고딕" w:hAnsi="맑은 고딕"/>
+          <w:sz w:val="19"/>
+          <w:szCs w:val="19"/>
+        </w:rPr>
+        <w:t>- 단속이력의 시간 정보: 14시가 39.1%로 입력 기본값 오염이다. 시간대 분석에 쓸 수 없다. 다만 빈도는 유효하며 고유 장소 2,123개가 상습주차 추정 모델의 레이블이 된다. 출동 시점의 상태가 아니라 사전 위험도라는 구분을 흐리지 않는다.</w:t>
+      </w:r>
+    </w:p>
+    <w:p>
+      <w:pPr>
+        <w:spacing w:after="140" w:before="0" w:line="264"/>
+      </w:pPr>
+      <w:r>
+        <w:rPr>
+          <w:rFonts w:ascii="맑은 고딕" w:cs="맑은 고딕" w:eastAsia="맑은 고딕" w:hAnsi="맑은 고딕"/>
+          <w:sz w:val="19"/>
+          <w:szCs w:val="19"/>
+        </w:rPr>
+        <w:t>- 공영주차장: 노외 64 / 노상 1로 유효폭과 무관하다.</w:t>
+      </w:r>
+    </w:p>
+    <w:p>
+      <w:pPr>
+        <w:spacing w:after="140" w:before="0" w:line="264"/>
+      </w:pPr>
+      <w:r>
+        <w:rPr>
+          <w:rFonts w:ascii="맑은 고딕" w:cs="맑은 고딕" w:eastAsia="맑은 고딕" w:hAnsi="맑은 고딕"/>
+          <w:sz w:val="19"/>
+          <w:szCs w:val="19"/>
+        </w:rPr>
+        <w:t>- 공개DEM: 90m 격자라 동명동이 12×12 픽셀이다.</w:t>
+      </w:r>
+    </w:p>
+    <w:p>
+      <w:pPr>
+        <w:spacing w:after="140" w:before="0" w:line="264"/>
+      </w:pPr>
+      <w:r>
+        <w:rPr>
+          <w:rFonts w:ascii="맑은 고딕" w:cs="맑은 고딕" w:eastAsia="맑은 고딕" w:hAnsi="맑은 고딕"/>
+          <w:sz w:val="19"/>
+          <w:szCs w:val="19"/>
+        </w:rPr>
+        <w:t>- 한전 전주: 좌표가 없고 전산화번호만 제공된다.</w:t>
+      </w:r>
+    </w:p>
+    <w:p>
+      <w:pPr>
+        <w:spacing w:after="140" w:before="0" w:line="264"/>
+      </w:pPr>
+      <w:r>
+        <w:rPr>
+          <w:rFonts w:ascii="맑은 고딕" w:cs="맑은 고딕" w:eastAsia="맑은 고딕" w:hAnsi="맑은 고딕"/>
+          <w:sz w:val="19"/>
+          <w:szCs w:val="19"/>
+        </w:rPr>
+        <w:t>- 지적도(소유권 경계): 소유권 경계는 통행 노면과 다르다.</w:t>
+      </w:r>
+    </w:p>
+    <w:p>
+      <w:pPr>
+        <w:spacing w:after="140" w:before="0" w:line="264"/>
+      </w:pPr>
+      <w:r>
+        <w:rPr>
+          <w:rFonts w:ascii="맑은 고딕" w:cs="맑은 고딕" w:eastAsia="맑은 고딕" w:hAnsi="맑은 고딕"/>
+          <w:sz w:val="19"/>
+          <w:szCs w:val="19"/>
+        </w:rPr>
+        <w:t>- 정밀도로지도: 광주는 광산구·북구 시범운행지구만 대상이며 동구는 제외다.</w:t>
+      </w:r>
+    </w:p>
+    <w:p>
+      <w:pPr>
+        <w:spacing w:after="140" w:before="0" w:line="264"/>
+      </w:pPr>
+      <w:r>
+        <w:rPr>
+          <w:rFonts w:ascii="맑은 고딕" w:cs="맑은 고딕" w:eastAsia="맑은 고딕" w:hAnsi="맑은 고딕"/>
+          <w:sz w:val="19"/>
+          <w:szCs w:val="19"/>
+        </w:rPr>
+        <w:t>'왜 그 데이터를 안 썼는가'는 심사에서 반드시 나오는 질문이다. 배제는 누락이 아니라 확인 후의 판단이며 그 근거를 여기 남긴다.</w:t>
+      </w:r>
+    </w:p>
+    <w:p>
+      <w:pPr>
         <w:spacing w:after="80" w:before="0" w:line="264"/>
       </w:pPr>
       <w:r>
@@ -30231,6 +30361,58 @@
           <w:szCs w:val="19"/>
         </w:rPr>
         <w:t>- 영상 판정 연동 이전에는 실시간 GREEN·RED가 0건이고 needs_cv + 커버 구간이 전부 잠정 YELLOW로 유지된다. 이는 설계된 동작이다.</w:t>
+      </w:r>
+    </w:p>
+    <w:p>
+      <w:pPr>
+        <w:spacing w:after="40" w:before="0" w:line="264"/>
+      </w:pPr>
+      <w:r>
+        <w:rPr>
+          <w:rFonts w:ascii="맑은 고딕" w:cs="맑은 고딕" w:eastAsia="맑은 고딕" w:hAnsi="맑은 고딕"/>
+          <w:sz w:val="19"/>
+          <w:szCs w:val="19"/>
+        </w:rPr>
+        <w:t>- 영상 판정을 붙여도 골목의 65%에는 적용할 수 없다. CCTV 유효범위 25m 안에 드는 구간이 380 / 1,101(34.5%)이고, CCTV 최단거리 중앙값은 39.3m, 최대 140m다. 영상판정 불가는 354구간 · 14,505m 이며 전체 연장의 30%에 해당한다. 알고리즘의 한계가 아니라 인프라의 한계다.</w:t>
+      </w:r>
+    </w:p>
+    <w:p>
+      <w:pPr>
+        <w:spacing w:after="40" w:before="0" w:line="264"/>
+      </w:pPr>
+      <w:r>
+        <w:rPr>
+          <w:rFonts w:ascii="맑은 고딕" w:cs="맑은 고딕" w:eastAsia="맑은 고딕" w:hAnsi="맑은 고딕"/>
+          <w:sz w:val="19"/>
+          <w:szCs w:val="19"/>
+        </w:rPr>
+        <w:t>- 완화 요소 — 영상판정 불가 구간이 담당하는 소방 통행량은 18%다. 주요 동선에는 대체로 CCTV가 있다. 그럼에도 이 사실을 감추지 않고 GRAY로 명시하는 것이 이 시스템의 설계 원칙이다.</w:t>
+      </w:r>
+    </w:p>
+    <w:p>
+      <w:pPr>
+        <w:spacing w:after="40" w:before="0" w:line="264"/>
+      </w:pPr>
+      <w:r>
+        <w:rPr>
+          <w:rFonts w:ascii="맑은 고딕" w:cs="맑은 고딕" w:eastAsia="맑은 고딕" w:hAnsi="맑은 고딕"/>
+          <w:sz w:val="19"/>
+          <w:szCs w:val="19"/>
+        </w:rPr>
+        <w:t>- GRAY 354구간의 사유는 네 가지이며 폭 산출 불가는 0건이다. 회색은 한 가지 뜻만 갖는다 — 카메라가 없어 못 본다. no_cctv_band 152(3~7m 대역, 주정차로 갈리는데 CCTV 25m 밖) / no_cctv_thin 128(노면 3m 미만이나 도로대장폭은 3m 이상 — 근거가 하나뿐) / no_cctv_narrow 62(노면·도로대장 모두 3m 미만이나 벽 사이는 여유) / no_cctv_single 12(7m 이상이나 표본 부족으로 통과 확정 보류).</w:t>
+      </w:r>
+    </w:p>
+    <w:p>
+      <w:pPr>
+        <w:spacing w:after="40" w:before="0" w:line="264"/>
+      </w:pPr>
+      <w:r>
+        <w:rPr>
+          <w:rFonts w:ascii="맑은 고딕" w:cs="맑은 고딕" w:eastAsia="맑은 고딕" w:hAnsi="맑은 고딕"/>
+          <w:sz w:val="19"/>
+          <w:szCs w:val="19"/>
+        </w:rPr>
+        <w:t>- 사유는 회색의 하위 구분이지 다섯 번째 색이 아니다. 범례에 별도 줄로 올리면 색이 5종으로 보이고 합계도 안 맞아 보인다. 하위 구분은 툴팁과 상세 패널에 넣는다.</w:t>
       </w:r>
     </w:p>
     <w:p>

</xml_diff>

<commit_message>
docs+gis: 팀 문서 축 대응표 신설 · 기획서 구간 키 seg_uid 전환 · route_vehicle.json 발행 · 회전 판정 범위(DECISIONS 82)
</commit_message>
<xml_diff>
--- a/docs/기획서_Fire-Lane.docx
+++ b/docs/기획서_Fire-Lane.docx
@@ -1472,7 +1472,7 @@
                 <w:sz w:val="18"/>
                 <w:szCs w:val="18"/>
               </w:rPr>
-              <w:t xml:space="preserve">• 5.1 관측점 등록 — 좌표(EPSG:5186)·시각·seg_id 자동 기록 + 기준 지물 서술(필수)</w:t>
+              <w:t>• 5.1 관측점 등록 — 좌표(EPSG:5186)·시각·seg_uid 자동 기록 + 기준 지물 서술(필수)</w:t>
             </w:r>
           </w:p>
           <w:p>
@@ -10131,7 +10131,7 @@
           <w:sz w:val="18"/>
           <w:szCs w:val="18"/>
         </w:rPr>
-        <w:t>• REQ-WID-003: 교차로 반경 5m 샘플 제외 후 최소·최대 폭 산출</w:t>
+        <w:t>• REQ-WID-003: 평면교차점 실형상으로 교차부를 제외한 뒤 최소·최대 폭 산출</w:t>
       </w:r>
     </w:p>
     <w:p>
@@ -10337,7 +10337,7 @@
           <w:sz w:val="18"/>
           <w:szCs w:val="18"/>
         </w:rPr>
-        <w:t xml:space="preserve">• REQ-VIS-006: 판정 결과 계약 스키마 전송 (seg_id · 통행폭 · 시각 · 신뢰도)</w:t>
+        <w:t>• REQ-VIS-006: 판정 결과 계약 스키마 전송 (seg_uid · 통행폭 · 시각 · 신뢰도)</w:t>
       </w:r>
     </w:p>
     <w:p>
@@ -13256,7 +13256,7 @@
                 <w:sz w:val="18"/>
                 <w:szCs w:val="18"/>
               </w:rPr>
-              <w:t>노드 반경 5m 내 샘플을 제외한 뒤 도로경계 기준 최소 폭을 width_min_m 으로, 건물 폴리곤 기준 벽~벽 최대 폭을 width_max_m 으로 확정한다. 교차로 폴리곤 위에서 폭이 폭발하는 문제를 최솟값이 아니라 구간 제외로 해결한다.</w:t>
+              <w:t>평면교차점(A0080000) 실형상 폴리곤 안의 샘플을 제외한 뒤 도로경계 기준 최소 폭을 width_min_m 으로, 건물 폴리곤 기준 벽~벽 최대 폭을 width_max_m 으로 확정한다. 교차부 형상이 없는 교차로에 한해 노드 반경 5m 로 폴백한다. 폭이 폭발하는 문제를 최솟값이 아니라 구간 제외로 해결한다.</w:t>
             </w:r>
           </w:p>
         </w:tc>
@@ -15161,7 +15161,7 @@
                 <w:sz w:val="18"/>
                 <w:szCs w:val="18"/>
               </w:rPr>
-              <w:t xml:space="preserve">seg_id, passable_width_m, observed_at, confidence를 담은 계약 스키마로 결과를 전송한다. GIS→비전은 관측점 선정만, 비전→GIS는 판정 결과만 전달한다.</w:t>
+              <w:t>seg_uid, passable_width_m, observed_at, confidence를 담은 계약 스키마로 결과를 전송한다. GIS→비전은 관측점 선정만, 비전→GIS는 판정 결과만 전달한다.</w:t>
             </w:r>
           </w:p>
         </w:tc>
@@ -20663,7 +20663,7 @@
           <w:sz w:val="18"/>
           <w:szCs w:val="18"/>
         </w:rPr>
-        <w:t xml:space="preserve">GIS ◀──[판정 결과]──── 비전     seg_id + 통행폭 + 관측 시각 + 신뢰도</w:t>
+        <w:t>GIS ◀──[판정 결과]──── 비전     seg_uid + 통행폭 + 관측 시각 + 신뢰도</w:t>
       </w:r>
     </w:p>
     <w:p>
@@ -20717,7 +20717,7 @@
           <w:sz w:val="17"/>
           <w:szCs w:val="17"/>
         </w:rPr>
-        <w:t xml:space="preserve">  "seg_id": "seg_2157",</w:t>
+        <w:t xml:space="preserve">  "seg_uid": "DM-192942-283921-YM7N",</w:t>
       </w:r>
     </w:p>
     <w:p>
@@ -22919,7 +22919,7 @@
                 <w:sz w:val="18"/>
                 <w:szCs w:val="18"/>
               </w:rPr>
-              <w:t xml:space="preserve">seg_id</w:t>
+              <w:t>seg_uid</w:t>
             </w:r>
           </w:p>
         </w:tc>
@@ -22969,7 +22969,7 @@
                 <w:sz w:val="18"/>
                 <w:szCs w:val="18"/>
               </w:rPr>
-              <w:t xml:space="preserve">세그먼트 식별자 (seg_0001 형식)</w:t>
+              <w:t>세그먼트 식별자. 실행 간 유지되는 키 (DM-192942-283921-YM7N 형식)</w:t>
             </w:r>
           </w:p>
         </w:tc>
@@ -24287,7 +24287,7 @@
                 <w:sz w:val="18"/>
                 <w:szCs w:val="18"/>
               </w:rPr>
-              <w:t xml:space="preserve">seg_id</w:t>
+              <w:t>seg_uid</w:t>
             </w:r>
           </w:p>
         </w:tc>
@@ -25116,7 +25116,7 @@
                 <w:sz w:val="18"/>
                 <w:szCs w:val="18"/>
               </w:rPr>
-              <w:t xml:space="preserve">seg_id</w:t>
+              <w:t>seg_uid</w:t>
             </w:r>
           </w:p>
         </w:tc>
@@ -26466,7 +26466,7 @@
                 <w:sz w:val="18"/>
                 <w:szCs w:val="18"/>
               </w:rPr>
-              <w:t xml:space="preserve">obs_id / seg_id</w:t>
+              <w:t>obs_id / seg_uid</w:t>
             </w:r>
           </w:p>
         </w:tc>
@@ -27816,7 +27816,7 @@
                 <w:sz w:val="18"/>
                 <w:szCs w:val="18"/>
               </w:rPr>
-              <w:t xml:space="preserve">path_seg_ids</w:t>
+              <w:t>path_seg_uids</w:t>
             </w:r>
           </w:p>
         </w:tc>
@@ -27970,7 +27970,7 @@
                 <w:sz w:val="18"/>
                 <w:szCs w:val="18"/>
               </w:rPr>
-              <w:t xml:space="preserve">excluded_seg_ids</w:t>
+              <w:t>excluded_seg_uids</w:t>
             </w:r>
           </w:p>
         </w:tc>
@@ -28988,7 +28988,7 @@
           <w:sz w:val="19"/>
           <w:szCs w:val="19"/>
         </w:rPr>
-        <w:t xml:space="preserve">3. 노드(교차점) 반경 5m 이내의 샘플을 제거한다. 중심선이 교차로 폴리곤 위를 지날 때 폭이 폭발하기 때문이다. 실제로 ROAD_BT 2.0인 구간에서 트랜섹트 60.00m, ROAD_BT 4.0인 구간에서 56.01m가 산출된 사례가 있다. 해법은 최솟값을 취하는 것이 아니라 교차로 구간을 제외하는 것이다.</w:t>
+        <w:t>3. 평면교차점(A0080000) 실형상 폴리곤 안의 샘플을 제거한다. 고정 반경은 작은 교차부에서 표본을 과잉 제거하고 큰 교차부에서는 오염을 흘리므로, 실측 형상 2,025개를 우선 신뢰하고 형상이 없는 교차로만 반경 5m 로 폴백한다. 중심선이 교차로 폴리곤 위를 지날 때 폭이 폭발하기 때문이다. 실제로 ROAD_BT 2.0인 구간에서 트랜섹트 60.00m, ROAD_BT 4.0인 구간에서 56.01m가 산출된 사례가 있다. 해법은 최솟값을 취하는 것이 아니라 교차로 구간을 제외하는 것이다.</w:t>
       </w:r>
     </w:p>
     <w:p>
@@ -29099,7 +29099,7 @@
           <w:sz w:val="16"/>
           <w:szCs w:val="16"/>
         </w:rPr>
-        <w:t xml:space="preserve">[그림 13]  도로폭 산출 — 법선 트랜섹트 샘플링과 교차로 반경 5m 제외</w:t>
+        <w:t>[그림 13]  도로폭 산출 — 법선 트랜섹트 샘플링과 평면교차점 실형상 제외</w:t>
       </w:r>
     </w:p>
     <w:p>
@@ -38017,7 +38017,7 @@
           <w:sz w:val="19"/>
           <w:szCs w:val="19"/>
         </w:rPr>
-        <w:t xml:space="preserve">1. seg_id + 관측점 ID</w:t>
+        <w:t>1. seg_uid + 관측점 ID</w:t>
       </w:r>
     </w:p>
     <w:p>
@@ -39944,7 +39944,7 @@
           <w:sz w:val="17"/>
           <w:szCs w:val="17"/>
         </w:rPr>
-        <w:t xml:space="preserve">  "seg_id": "seg_2157",</w:t>
+        <w:t xml:space="preserve">  "seg_uid": "DM-192942-283921-YM7N",</w:t>
       </w:r>
     </w:p>
     <w:p>
@@ -41721,7 +41721,7 @@
                 <w:sz w:val="18"/>
                 <w:szCs w:val="18"/>
               </w:rPr>
-              <w:t xml:space="preserve">/api/segments/{seg_id}</w:t>
+              <w:t>/api/segments/{seg_uid}</w:t>
             </w:r>
           </w:p>
         </w:tc>
@@ -41823,7 +41823,7 @@
                 <w:sz w:val="18"/>
                 <w:szCs w:val="18"/>
               </w:rPr>
-              <w:t xml:space="preserve">동적 계층 폴링. 마지막 조회 이후 변경된 seg_id와 status만 반환</w:t>
+              <w:t>동적 계층 폴링. 마지막 조회 이후 변경된 seg_uid와 status만 반환</w:t>
             </w:r>
           </w:p>
         </w:tc>

</xml_diff>